<commit_message>
Fix title page formatting in report.pdf and report.docx to match university standard
</commit_message>
<xml_diff>
--- a/students/ai-243/ipatov-bohdan/lab4/report.docx
+++ b/students/ai-243/ipatov-bohdan/lab4/report.docx
@@ -4,13 +4,28 @@
   <w:body>
     <w:p>
       <w:pPr>
-        <w:spacing w:before="0" w:after="60" w:line="276" w:lineRule="auto"/>
+        <w:spacing w:before="0" w:after="40" w:line="276" w:lineRule="auto"/>
         <w:jc w:val="center"/>
       </w:pPr>
       <w:r>
         <w:rPr>
           <w:rFonts w:ascii="Times New Roman" w:hAnsi="Times New Roman"/>
           <w:b/>
+          <w:i w:val="0"/>
+          <w:sz w:val="26"/>
+        </w:rPr>
+        <w:t>НАЦІОНАЛЬНИЙ УНІВЕРСИТЕТ «ОДЕСЬКА ПОЛІТЕХНІКА»</w:t>
+      </w:r>
+    </w:p>
+    <w:p>
+      <w:pPr>
+        <w:spacing w:before="0" w:after="40" w:line="276" w:lineRule="auto"/>
+        <w:jc w:val="center"/>
+      </w:pPr>
+      <w:r>
+        <w:rPr>
+          <w:rFonts w:ascii="Times New Roman" w:hAnsi="Times New Roman"/>
+          <w:b w:val="0"/>
           <w:i w:val="0"/>
           <w:sz w:val="22"/>
         </w:rPr>
@@ -19,22 +34,7 @@
     </w:p>
     <w:p>
       <w:pPr>
-        <w:spacing w:before="0" w:after="60" w:line="276" w:lineRule="auto"/>
-        <w:jc w:val="center"/>
-      </w:pPr>
-      <w:r>
-        <w:rPr>
-          <w:rFonts w:ascii="Times New Roman" w:hAnsi="Times New Roman"/>
-          <w:b/>
-          <w:i w:val="0"/>
-          <w:sz w:val="24"/>
-        </w:rPr>
-        <w:t>ДЕРЖАВНИЙ УНІВЕРСИТЕТ «ОДЕСЬКА ПОЛІТЕХНІКА»</w:t>
-      </w:r>
-    </w:p>
-    <w:p>
-      <w:pPr>
-        <w:spacing w:before="0" w:after="60" w:line="276" w:lineRule="auto"/>
+        <w:spacing w:before="0" w:after="40" w:line="276" w:lineRule="auto"/>
         <w:jc w:val="center"/>
       </w:pPr>
       <w:r>
@@ -44,12 +44,12 @@
           <w:i w:val="0"/>
           <w:sz w:val="22"/>
         </w:rPr>
-        <w:t>ІНСТИТУТ КОМП'ЮТЕРНИХ СИСТЕМ</w:t>
+        <w:t>ІНСТИТУТ КОМП’ЮТЕРНИХ СИСТЕМ</w:t>
       </w:r>
     </w:p>
     <w:p>
       <w:pPr>
-        <w:spacing w:before="0" w:after="720" w:line="276" w:lineRule="auto"/>
+        <w:spacing w:before="0" w:after="800" w:line="276" w:lineRule="auto"/>
         <w:jc w:val="center"/>
       </w:pPr>
       <w:r>
@@ -59,12 +59,12 @@
           <w:i w:val="0"/>
           <w:sz w:val="22"/>
         </w:rPr>
-        <w:t>КАФЕДРА КІБЕРБЕЗПЕКИ ТА ПРОГРАМНОГО ЗАБЕЗПЕЧЕННЯ</w:t>
+        <w:t>КАФЕДРА ІНФОРМАЦІЙНИХ СИСТЕМ</w:t>
       </w:r>
     </w:p>
     <w:p>
       <w:pPr>
-        <w:spacing w:before="0" w:after="120" w:line="276" w:lineRule="auto"/>
+        <w:spacing w:before="0" w:after="80" w:line="276" w:lineRule="auto"/>
         <w:jc w:val="center"/>
       </w:pPr>
       <w:r>
@@ -74,7 +74,7 @@
           <w:i w:val="0"/>
           <w:sz w:val="32"/>
         </w:rPr>
-        <w:t>ЗВІТ</w:t>
+        <w:t>Протокол лабораторної роботи №4</w:t>
       </w:r>
     </w:p>
     <w:p>
@@ -87,14 +87,14 @@
           <w:rFonts w:ascii="Times New Roman" w:hAnsi="Times New Roman"/>
           <w:b/>
           <w:i w:val="0"/>
-          <w:sz w:val="26"/>
+          <w:sz w:val="28"/>
         </w:rPr>
-        <w:t>про виконання лабораторної роботи №4</w:t>
+        <w:t>«Контекст, стан і кеш агента»</w:t>
       </w:r>
     </w:p>
     <w:p>
       <w:pPr>
-        <w:spacing w:before="0" w:after="240" w:line="276" w:lineRule="auto"/>
+        <w:spacing w:before="0" w:after="120" w:line="276" w:lineRule="auto"/>
         <w:jc w:val="center"/>
       </w:pPr>
       <w:r>
@@ -104,27 +104,12 @@
           <w:i/>
           <w:sz w:val="24"/>
         </w:rPr>
-        <w:t>з дисципліни «Обчислювальні методи»</w:t>
+        <w:t>з дисципліни: «Обчислювальні методи»</w:t>
       </w:r>
     </w:p>
     <w:p>
       <w:pPr>
-        <w:spacing w:before="0" w:after="120" w:line="276" w:lineRule="auto"/>
-        <w:jc w:val="center"/>
-      </w:pPr>
-      <w:r>
-        <w:rPr>
-          <w:rFonts w:ascii="Times New Roman" w:hAnsi="Times New Roman"/>
-          <w:b/>
-          <w:i w:val="0"/>
-          <w:sz w:val="26"/>
-        </w:rPr>
-        <w:t>Тема: «Контекст, стан і кеш агента»</w:t>
-      </w:r>
-    </w:p>
-    <w:p>
-      <w:pPr>
-        <w:spacing w:before="0" w:after="960" w:line="276" w:lineRule="auto"/>
+        <w:spacing w:before="0" w:after="800" w:line="276" w:lineRule="auto"/>
         <w:jc w:val="center"/>
       </w:pPr>
       <w:r>
@@ -137,10 +122,204 @@
         <w:t>Варіант 11 (Предметна область: «Бібліотека»)</w:t>
       </w:r>
     </w:p>
+    <w:tbl>
+      <w:tblPr>
+        <w:tblW w:type="auto" w:w="0"/>
+        <w:jc w:val="center"/>
+        <w:tblLook w:firstColumn="1" w:firstRow="1" w:lastColumn="0" w:lastRow="0" w:noHBand="0" w:noVBand="1" w:val="04A0"/>
+      </w:tblPr>
+      <w:tblGrid>
+        <w:gridCol w:w="4989"/>
+        <w:gridCol w:w="4989"/>
+      </w:tblGrid>
+      <w:tr>
+        <w:tc>
+          <w:tcPr>
+            <w:tcW w:type="dxa" w:w="4608"/>
+            <w:vAlign w:val="center"/>
+          </w:tcPr>
+          <w:p>
+            <w:pPr>
+              <w:spacing w:after="40" w:before="40" w:line="240" w:lineRule="auto"/>
+              <w:jc w:val="left"/>
+            </w:pPr>
+            <w:r>
+              <w:rPr>
+                <w:rFonts w:ascii="Times New Roman" w:hAnsi="Times New Roman"/>
+                <w:b/>
+                <w:i w:val="0"/>
+                <w:color w:val="000000"/>
+                <w:sz w:val="23"/>
+              </w:rPr>
+              <w:t>Виконав:</w:t>
+            </w:r>
+          </w:p>
+        </w:tc>
+        <w:tc>
+          <w:tcPr>
+            <w:tcW w:type="dxa" w:w="5184"/>
+            <w:vAlign w:val="center"/>
+          </w:tcPr>
+          <w:p>
+            <w:pPr>
+              <w:spacing w:after="40" w:before="40" w:line="240" w:lineRule="auto"/>
+              <w:jc w:val="left"/>
+            </w:pPr>
+            <w:r>
+              <w:rPr>
+                <w:rFonts w:ascii="Times New Roman" w:hAnsi="Times New Roman"/>
+                <w:b w:val="0"/>
+                <w:i w:val="0"/>
+                <w:color w:val="000000"/>
+                <w:sz w:val="23"/>
+              </w:rPr>
+              <w:t>студент групи АІ-243</w:t>
+            </w:r>
+          </w:p>
+        </w:tc>
+      </w:tr>
+      <w:tr>
+        <w:tc>
+          <w:tcPr>
+            <w:tcW w:type="dxa" w:w="4608"/>
+            <w:vAlign w:val="center"/>
+          </w:tcPr>
+          <w:p>
+            <w:pPr>
+              <w:spacing w:after="40" w:before="40" w:line="240" w:lineRule="auto"/>
+              <w:jc w:val="left"/>
+            </w:pPr>
+            <w:r>
+              <w:rPr>
+                <w:rFonts w:ascii="Times New Roman" w:hAnsi="Times New Roman"/>
+                <w:b w:val="0"/>
+                <w:i w:val="0"/>
+                <w:color w:val="000000"/>
+                <w:sz w:val="23"/>
+              </w:rPr>
+            </w:r>
+          </w:p>
+        </w:tc>
+        <w:tc>
+          <w:tcPr>
+            <w:tcW w:type="dxa" w:w="5184"/>
+            <w:vAlign w:val="center"/>
+          </w:tcPr>
+          <w:p>
+            <w:pPr>
+              <w:spacing w:after="40" w:before="40" w:line="240" w:lineRule="auto"/>
+              <w:jc w:val="left"/>
+            </w:pPr>
+            <w:r>
+              <w:rPr>
+                <w:rFonts w:ascii="Times New Roman" w:hAnsi="Times New Roman"/>
+                <w:b/>
+                <w:i w:val="0"/>
+                <w:color w:val="000000"/>
+                <w:sz w:val="23"/>
+              </w:rPr>
+              <w:t>Іпатов Богдан Сергійович</w:t>
+            </w:r>
+          </w:p>
+        </w:tc>
+      </w:tr>
+      <w:tr>
+        <w:tc>
+          <w:tcPr>
+            <w:tcW w:type="dxa" w:w="4608"/>
+            <w:vAlign w:val="center"/>
+          </w:tcPr>
+          <w:p>
+            <w:pPr>
+              <w:spacing w:after="40" w:before="40" w:line="240" w:lineRule="auto"/>
+              <w:jc w:val="left"/>
+            </w:pPr>
+            <w:r>
+              <w:rPr>
+                <w:rFonts w:ascii="Times New Roman" w:hAnsi="Times New Roman"/>
+                <w:b/>
+                <w:i w:val="0"/>
+                <w:color w:val="000000"/>
+                <w:sz w:val="23"/>
+              </w:rPr>
+              <w:t>Варіант:</w:t>
+            </w:r>
+          </w:p>
+        </w:tc>
+        <w:tc>
+          <w:tcPr>
+            <w:tcW w:type="dxa" w:w="5184"/>
+            <w:vAlign w:val="center"/>
+          </w:tcPr>
+          <w:p>
+            <w:pPr>
+              <w:spacing w:after="40" w:before="40" w:line="240" w:lineRule="auto"/>
+              <w:jc w:val="left"/>
+            </w:pPr>
+            <w:r>
+              <w:rPr>
+                <w:rFonts w:ascii="Times New Roman" w:hAnsi="Times New Roman"/>
+                <w:b/>
+                <w:i w:val="0"/>
+                <w:color w:val="000000"/>
+                <w:sz w:val="23"/>
+              </w:rPr>
+              <w:t>11 (Бібліотека)</w:t>
+            </w:r>
+          </w:p>
+        </w:tc>
+      </w:tr>
+      <w:tr>
+        <w:tc>
+          <w:tcPr>
+            <w:tcW w:type="dxa" w:w="4608"/>
+            <w:vAlign w:val="center"/>
+          </w:tcPr>
+          <w:p>
+            <w:pPr>
+              <w:spacing w:after="40" w:before="40" w:line="240" w:lineRule="auto"/>
+              <w:jc w:val="left"/>
+            </w:pPr>
+            <w:r>
+              <w:rPr>
+                <w:rFonts w:ascii="Times New Roman" w:hAnsi="Times New Roman"/>
+                <w:b/>
+                <w:i w:val="0"/>
+                <w:color w:val="000000"/>
+                <w:sz w:val="23"/>
+              </w:rPr>
+              <w:t>Перевірив:</w:t>
+            </w:r>
+          </w:p>
+        </w:tc>
+        <w:tc>
+          <w:tcPr>
+            <w:tcW w:type="dxa" w:w="5184"/>
+            <w:vAlign w:val="center"/>
+          </w:tcPr>
+          <w:p>
+            <w:pPr>
+              <w:spacing w:after="40" w:before="40" w:line="240" w:lineRule="auto"/>
+              <w:jc w:val="left"/>
+            </w:pPr>
+            <w:r>
+              <w:rPr>
+                <w:rFonts w:ascii="Times New Roman" w:hAnsi="Times New Roman"/>
+                <w:b w:val="0"/>
+                <w:i w:val="0"/>
+                <w:color w:val="000000"/>
+                <w:sz w:val="23"/>
+              </w:rPr>
+              <w:t>ас. Баранов О.М.</w:t>
+            </w:r>
+          </w:p>
+        </w:tc>
+      </w:tr>
+    </w:tbl>
     <w:p>
       <w:pPr>
-        <w:spacing w:before="0" w:after="60" w:line="276" w:lineRule="auto"/>
-        <w:jc w:val="right"/>
+        <w:spacing w:before="0" w:after="240" w:line="276" w:lineRule="auto"/>
+        <w:jc w:val="left"/>
       </w:pPr>
       <w:r>
         <w:rPr>
@@ -149,13 +328,12 @@
           <w:i w:val="0"/>
           <w:sz w:val="22"/>
         </w:rPr>
-        <w:t>Виконав:</w:t>
       </w:r>
     </w:p>
     <w:p>
       <w:pPr>
-        <w:spacing w:before="0" w:after="60" w:line="276" w:lineRule="auto"/>
-        <w:jc w:val="right"/>
+        <w:spacing w:before="0" w:after="240" w:line="276" w:lineRule="auto"/>
+        <w:jc w:val="left"/>
       </w:pPr>
       <w:r>
         <w:rPr>
@@ -164,28 +342,12 @@
           <w:i w:val="0"/>
           <w:sz w:val="22"/>
         </w:rPr>
-        <w:t>студент групи АІ-243</w:t>
       </w:r>
     </w:p>
     <w:p>
       <w:pPr>
         <w:spacing w:before="0" w:after="240" w:line="276" w:lineRule="auto"/>
-        <w:jc w:val="right"/>
-      </w:pPr>
-      <w:r>
-        <w:rPr>
-          <w:rFonts w:ascii="Times New Roman" w:hAnsi="Times New Roman"/>
-          <w:b/>
-          <w:i w:val="0"/>
-          <w:sz w:val="22"/>
-        </w:rPr>
-        <w:t>Іпатов Богдан Сергійович</w:t>
-      </w:r>
-    </w:p>
-    <w:p>
-      <w:pPr>
-        <w:spacing w:before="0" w:after="60" w:line="276" w:lineRule="auto"/>
-        <w:jc w:val="right"/>
+        <w:jc w:val="left"/>
       </w:pPr>
       <w:r>
         <w:rPr>
@@ -194,13 +356,12 @@
           <w:i w:val="0"/>
           <w:sz w:val="22"/>
         </w:rPr>
-        <w:t>Перевірив:</w:t>
       </w:r>
     </w:p>
     <w:p>
       <w:pPr>
-        <w:spacing w:before="0" w:after="60" w:line="276" w:lineRule="auto"/>
-        <w:jc w:val="right"/>
+        <w:spacing w:before="0" w:after="240" w:line="276" w:lineRule="auto"/>
+        <w:jc w:val="left"/>
       </w:pPr>
       <w:r>
         <w:rPr>
@@ -209,35 +370,47 @@
           <w:i w:val="0"/>
           <w:sz w:val="22"/>
         </w:rPr>
-        <w:t>асистент кафедри КБПЗ</w:t>
       </w:r>
     </w:p>
     <w:p>
       <w:pPr>
-        <w:spacing w:before="0" w:after="1440" w:line="276" w:lineRule="auto"/>
-        <w:jc w:val="right"/>
+        <w:spacing w:before="0" w:after="240" w:line="276" w:lineRule="auto"/>
+        <w:jc w:val="left"/>
+      </w:pPr>
+      <w:r>
+        <w:rPr>
+          <w:rFonts w:ascii="Times New Roman" w:hAnsi="Times New Roman"/>
+          <w:b w:val="0"/>
+          <w:i w:val="0"/>
+          <w:sz w:val="22"/>
+        </w:rPr>
+      </w:r>
+    </w:p>
+    <w:p>
+      <w:pPr>
+        <w:spacing w:before="0" w:after="240" w:line="276" w:lineRule="auto"/>
+        <w:jc w:val="left"/>
+      </w:pPr>
+      <w:r>
+        <w:rPr>
+          <w:rFonts w:ascii="Times New Roman" w:hAnsi="Times New Roman"/>
+          <w:b w:val="0"/>
+          <w:i w:val="0"/>
+          <w:sz w:val="22"/>
+        </w:rPr>
+      </w:r>
+    </w:p>
+    <w:p>
+      <w:pPr>
+        <w:spacing w:before="0" w:after="60" w:line="276" w:lineRule="auto"/>
+        <w:jc w:val="center"/>
       </w:pPr>
       <w:r>
         <w:rPr>
           <w:rFonts w:ascii="Times New Roman" w:hAnsi="Times New Roman"/>
           <w:b/>
           <w:i w:val="0"/>
-          <w:sz w:val="22"/>
-        </w:rPr>
-        <w:t>Баранов О.М.</w:t>
-      </w:r>
-    </w:p>
-    <w:p>
-      <w:pPr>
-        <w:spacing w:before="0" w:after="60" w:line="276" w:lineRule="auto"/>
-        <w:jc w:val="center"/>
-      </w:pPr>
-      <w:r>
-        <w:rPr>
-          <w:rFonts w:ascii="Times New Roman" w:hAnsi="Times New Roman"/>
-          <w:b/>
-          <w:i w:val="0"/>
-          <w:sz w:val="22"/>
+          <w:sz w:val="24"/>
         </w:rPr>
         <w:t>Одеса – 2026</w:t>
       </w:r>
@@ -292,13 +465,13 @@
         </w:tblBorders>
       </w:tblPr>
       <w:tblGrid>
-        <w:gridCol w:w="4982"/>
-        <w:gridCol w:w="4982"/>
+        <w:gridCol w:w="4989"/>
+        <w:gridCol w:w="4989"/>
       </w:tblGrid>
       <w:tr>
         <w:tc>
           <w:tcPr>
-            <w:tcW w:type="dxa" w:w="4982"/>
+            <w:tcW w:type="dxa" w:w="4989"/>
             <w:vAlign w:val="center"/>
             <w:shd w:fill="E8EEF5"/>
           </w:tcPr>
@@ -318,7 +491,7 @@
         </w:tc>
         <w:tc>
           <w:tcPr>
-            <w:tcW w:type="dxa" w:w="4982"/>
+            <w:tcW w:type="dxa" w:w="4989"/>
             <w:vAlign w:val="center"/>
             <w:shd w:fill="E8EEF5"/>
           </w:tcPr>
@@ -340,7 +513,7 @@
       <w:tr>
         <w:tc>
           <w:tcPr>
-            <w:tcW w:type="dxa" w:w="4982"/>
+            <w:tcW w:type="dxa" w:w="4989"/>
             <w:vAlign w:val="center"/>
           </w:tcPr>
           <w:p>
@@ -358,7 +531,7 @@
         </w:tc>
         <w:tc>
           <w:tcPr>
-            <w:tcW w:type="dxa" w:w="4982"/>
+            <w:tcW w:type="dxa" w:w="4989"/>
             <w:vAlign w:val="center"/>
           </w:tcPr>
           <w:p>
@@ -378,7 +551,7 @@
       <w:tr>
         <w:tc>
           <w:tcPr>
-            <w:tcW w:type="dxa" w:w="4982"/>
+            <w:tcW w:type="dxa" w:w="4989"/>
             <w:vAlign w:val="center"/>
           </w:tcPr>
           <w:p>
@@ -396,7 +569,7 @@
         </w:tc>
         <w:tc>
           <w:tcPr>
-            <w:tcW w:type="dxa" w:w="4982"/>
+            <w:tcW w:type="dxa" w:w="4989"/>
             <w:vAlign w:val="center"/>
           </w:tcPr>
           <w:p>
@@ -416,7 +589,7 @@
       <w:tr>
         <w:tc>
           <w:tcPr>
-            <w:tcW w:type="dxa" w:w="4982"/>
+            <w:tcW w:type="dxa" w:w="4989"/>
             <w:vAlign w:val="center"/>
           </w:tcPr>
           <w:p>
@@ -434,7 +607,7 @@
         </w:tc>
         <w:tc>
           <w:tcPr>
-            <w:tcW w:type="dxa" w:w="4982"/>
+            <w:tcW w:type="dxa" w:w="4989"/>
             <w:vAlign w:val="center"/>
           </w:tcPr>
           <w:p>
@@ -454,7 +627,7 @@
       <w:tr>
         <w:tc>
           <w:tcPr>
-            <w:tcW w:type="dxa" w:w="4982"/>
+            <w:tcW w:type="dxa" w:w="4989"/>
             <w:vAlign w:val="center"/>
           </w:tcPr>
           <w:p>
@@ -472,7 +645,7 @@
         </w:tc>
         <w:tc>
           <w:tcPr>
-            <w:tcW w:type="dxa" w:w="4982"/>
+            <w:tcW w:type="dxa" w:w="4989"/>
             <w:vAlign w:val="center"/>
           </w:tcPr>
           <w:p>
@@ -492,7 +665,7 @@
       <w:tr>
         <w:tc>
           <w:tcPr>
-            <w:tcW w:type="dxa" w:w="4982"/>
+            <w:tcW w:type="dxa" w:w="4989"/>
             <w:vAlign w:val="center"/>
           </w:tcPr>
           <w:p>
@@ -510,7 +683,7 @@
         </w:tc>
         <w:tc>
           <w:tcPr>
-            <w:tcW w:type="dxa" w:w="4982"/>
+            <w:tcW w:type="dxa" w:w="4989"/>
             <w:vAlign w:val="center"/>
           </w:tcPr>
           <w:p>
@@ -530,7 +703,7 @@
       <w:tr>
         <w:tc>
           <w:tcPr>
-            <w:tcW w:type="dxa" w:w="4982"/>
+            <w:tcW w:type="dxa" w:w="4989"/>
             <w:vAlign w:val="center"/>
           </w:tcPr>
           <w:p>
@@ -548,7 +721,7 @@
         </w:tc>
         <w:tc>
           <w:tcPr>
-            <w:tcW w:type="dxa" w:w="4982"/>
+            <w:tcW w:type="dxa" w:w="4989"/>
             <w:vAlign w:val="center"/>
           </w:tcPr>
           <w:p>
@@ -568,7 +741,7 @@
       <w:tr>
         <w:tc>
           <w:tcPr>
-            <w:tcW w:type="dxa" w:w="4982"/>
+            <w:tcW w:type="dxa" w:w="4989"/>
             <w:vAlign w:val="center"/>
           </w:tcPr>
           <w:p>
@@ -586,7 +759,7 @@
         </w:tc>
         <w:tc>
           <w:tcPr>
-            <w:tcW w:type="dxa" w:w="4982"/>
+            <w:tcW w:type="dxa" w:w="4989"/>
             <w:vAlign w:val="center"/>
           </w:tcPr>
           <w:p>
@@ -606,7 +779,7 @@
       <w:tr>
         <w:tc>
           <w:tcPr>
-            <w:tcW w:type="dxa" w:w="4982"/>
+            <w:tcW w:type="dxa" w:w="4989"/>
             <w:vAlign w:val="center"/>
           </w:tcPr>
           <w:p>
@@ -624,7 +797,7 @@
         </w:tc>
         <w:tc>
           <w:tcPr>
-            <w:tcW w:type="dxa" w:w="4982"/>
+            <w:tcW w:type="dxa" w:w="4989"/>
             <w:vAlign w:val="center"/>
           </w:tcPr>
           <w:p>
@@ -644,7 +817,7 @@
       <w:tr>
         <w:tc>
           <w:tcPr>
-            <w:tcW w:type="dxa" w:w="4982"/>
+            <w:tcW w:type="dxa" w:w="4989"/>
             <w:vAlign w:val="center"/>
           </w:tcPr>
           <w:p>
@@ -662,7 +835,7 @@
         </w:tc>
         <w:tc>
           <w:tcPr>
-            <w:tcW w:type="dxa" w:w="4982"/>
+            <w:tcW w:type="dxa" w:w="4989"/>
             <w:vAlign w:val="center"/>
           </w:tcPr>
           <w:p>
@@ -1069,15 +1242,15 @@
         </w:tblBorders>
       </w:tblPr>
       <w:tblGrid>
-        <w:gridCol w:w="2491"/>
-        <w:gridCol w:w="2491"/>
-        <w:gridCol w:w="2491"/>
-        <w:gridCol w:w="2491"/>
+        <w:gridCol w:w="2495"/>
+        <w:gridCol w:w="2495"/>
+        <w:gridCol w:w="2495"/>
+        <w:gridCol w:w="2495"/>
       </w:tblGrid>
       <w:tr>
         <w:tc>
           <w:tcPr>
-            <w:tcW w:type="dxa" w:w="2491"/>
+            <w:tcW w:type="dxa" w:w="2495"/>
             <w:vAlign w:val="center"/>
             <w:shd w:fill="E8EEF5"/>
           </w:tcPr>
@@ -1097,7 +1270,7 @@
         </w:tc>
         <w:tc>
           <w:tcPr>
-            <w:tcW w:type="dxa" w:w="2491"/>
+            <w:tcW w:type="dxa" w:w="2495"/>
             <w:vAlign w:val="center"/>
             <w:shd w:fill="E8EEF5"/>
           </w:tcPr>
@@ -1117,7 +1290,7 @@
         </w:tc>
         <w:tc>
           <w:tcPr>
-            <w:tcW w:type="dxa" w:w="2491"/>
+            <w:tcW w:type="dxa" w:w="2495"/>
             <w:vAlign w:val="center"/>
             <w:shd w:fill="E8EEF5"/>
           </w:tcPr>
@@ -1137,7 +1310,7 @@
         </w:tc>
         <w:tc>
           <w:tcPr>
-            <w:tcW w:type="dxa" w:w="2491"/>
+            <w:tcW w:type="dxa" w:w="2495"/>
             <w:vAlign w:val="center"/>
             <w:shd w:fill="E8EEF5"/>
           </w:tcPr>
@@ -1159,7 +1332,7 @@
       <w:tr>
         <w:tc>
           <w:tcPr>
-            <w:tcW w:type="dxa" w:w="2491"/>
+            <w:tcW w:type="dxa" w:w="2495"/>
             <w:vAlign w:val="center"/>
           </w:tcPr>
           <w:p>
@@ -1177,7 +1350,7 @@
         </w:tc>
         <w:tc>
           <w:tcPr>
-            <w:tcW w:type="dxa" w:w="2491"/>
+            <w:tcW w:type="dxa" w:w="2495"/>
             <w:vAlign w:val="center"/>
           </w:tcPr>
           <w:p>
@@ -1195,7 +1368,7 @@
         </w:tc>
         <w:tc>
           <w:tcPr>
-            <w:tcW w:type="dxa" w:w="2491"/>
+            <w:tcW w:type="dxa" w:w="2495"/>
             <w:vAlign w:val="center"/>
           </w:tcPr>
           <w:p>
@@ -1213,7 +1386,7 @@
         </w:tc>
         <w:tc>
           <w:tcPr>
-            <w:tcW w:type="dxa" w:w="2491"/>
+            <w:tcW w:type="dxa" w:w="2495"/>
             <w:vAlign w:val="center"/>
           </w:tcPr>
           <w:p>
@@ -1233,7 +1406,7 @@
       <w:tr>
         <w:tc>
           <w:tcPr>
-            <w:tcW w:type="dxa" w:w="2491"/>
+            <w:tcW w:type="dxa" w:w="2495"/>
             <w:vAlign w:val="center"/>
           </w:tcPr>
           <w:p>
@@ -1251,7 +1424,7 @@
         </w:tc>
         <w:tc>
           <w:tcPr>
-            <w:tcW w:type="dxa" w:w="2491"/>
+            <w:tcW w:type="dxa" w:w="2495"/>
             <w:vAlign w:val="center"/>
           </w:tcPr>
           <w:p>
@@ -1269,7 +1442,7 @@
         </w:tc>
         <w:tc>
           <w:tcPr>
-            <w:tcW w:type="dxa" w:w="2491"/>
+            <w:tcW w:type="dxa" w:w="2495"/>
             <w:vAlign w:val="center"/>
           </w:tcPr>
           <w:p>
@@ -1287,7 +1460,7 @@
         </w:tc>
         <w:tc>
           <w:tcPr>
-            <w:tcW w:type="dxa" w:w="2491"/>
+            <w:tcW w:type="dxa" w:w="2495"/>
             <w:vAlign w:val="center"/>
           </w:tcPr>
           <w:p>
@@ -1679,16 +1852,16 @@
         </w:tblBorders>
       </w:tblPr>
       <w:tblGrid>
-        <w:gridCol w:w="1993"/>
-        <w:gridCol w:w="1993"/>
-        <w:gridCol w:w="1993"/>
-        <w:gridCol w:w="1993"/>
-        <w:gridCol w:w="1993"/>
+        <w:gridCol w:w="1996"/>
+        <w:gridCol w:w="1996"/>
+        <w:gridCol w:w="1996"/>
+        <w:gridCol w:w="1996"/>
+        <w:gridCol w:w="1996"/>
       </w:tblGrid>
       <w:tr>
         <w:tc>
           <w:tcPr>
-            <w:tcW w:type="dxa" w:w="1993"/>
+            <w:tcW w:type="dxa" w:w="1996"/>
             <w:vAlign w:val="center"/>
             <w:shd w:fill="E8EEF5"/>
           </w:tcPr>
@@ -1708,7 +1881,7 @@
         </w:tc>
         <w:tc>
           <w:tcPr>
-            <w:tcW w:type="dxa" w:w="1993"/>
+            <w:tcW w:type="dxa" w:w="1996"/>
             <w:vAlign w:val="center"/>
             <w:shd w:fill="E8EEF5"/>
           </w:tcPr>
@@ -1728,7 +1901,7 @@
         </w:tc>
         <w:tc>
           <w:tcPr>
-            <w:tcW w:type="dxa" w:w="1993"/>
+            <w:tcW w:type="dxa" w:w="1996"/>
             <w:vAlign w:val="center"/>
             <w:shd w:fill="E8EEF5"/>
           </w:tcPr>
@@ -1748,7 +1921,7 @@
         </w:tc>
         <w:tc>
           <w:tcPr>
-            <w:tcW w:type="dxa" w:w="1993"/>
+            <w:tcW w:type="dxa" w:w="1996"/>
             <w:vAlign w:val="center"/>
             <w:shd w:fill="E8EEF5"/>
           </w:tcPr>
@@ -1768,7 +1941,7 @@
         </w:tc>
         <w:tc>
           <w:tcPr>
-            <w:tcW w:type="dxa" w:w="1993"/>
+            <w:tcW w:type="dxa" w:w="1996"/>
             <w:vAlign w:val="center"/>
             <w:shd w:fill="E8EEF5"/>
           </w:tcPr>
@@ -1790,7 +1963,7 @@
       <w:tr>
         <w:tc>
           <w:tcPr>
-            <w:tcW w:type="dxa" w:w="1993"/>
+            <w:tcW w:type="dxa" w:w="1996"/>
             <w:vAlign w:val="center"/>
           </w:tcPr>
           <w:p>
@@ -1808,7 +1981,7 @@
         </w:tc>
         <w:tc>
           <w:tcPr>
-            <w:tcW w:type="dxa" w:w="1993"/>
+            <w:tcW w:type="dxa" w:w="1996"/>
             <w:vAlign w:val="center"/>
           </w:tcPr>
           <w:p>
@@ -1826,7 +1999,7 @@
         </w:tc>
         <w:tc>
           <w:tcPr>
-            <w:tcW w:type="dxa" w:w="1993"/>
+            <w:tcW w:type="dxa" w:w="1996"/>
             <w:vAlign w:val="center"/>
           </w:tcPr>
           <w:p>
@@ -1844,7 +2017,7 @@
         </w:tc>
         <w:tc>
           <w:tcPr>
-            <w:tcW w:type="dxa" w:w="1993"/>
+            <w:tcW w:type="dxa" w:w="1996"/>
             <w:vAlign w:val="center"/>
           </w:tcPr>
           <w:p>
@@ -1862,7 +2035,7 @@
         </w:tc>
         <w:tc>
           <w:tcPr>
-            <w:tcW w:type="dxa" w:w="1993"/>
+            <w:tcW w:type="dxa" w:w="1996"/>
             <w:vAlign w:val="center"/>
           </w:tcPr>
           <w:p>
@@ -1882,7 +2055,7 @@
       <w:tr>
         <w:tc>
           <w:tcPr>
-            <w:tcW w:type="dxa" w:w="1993"/>
+            <w:tcW w:type="dxa" w:w="1996"/>
             <w:vAlign w:val="center"/>
           </w:tcPr>
           <w:p>
@@ -1900,7 +2073,7 @@
         </w:tc>
         <w:tc>
           <w:tcPr>
-            <w:tcW w:type="dxa" w:w="1993"/>
+            <w:tcW w:type="dxa" w:w="1996"/>
             <w:vAlign w:val="center"/>
           </w:tcPr>
           <w:p>
@@ -1918,7 +2091,7 @@
         </w:tc>
         <w:tc>
           <w:tcPr>
-            <w:tcW w:type="dxa" w:w="1993"/>
+            <w:tcW w:type="dxa" w:w="1996"/>
             <w:vAlign w:val="center"/>
           </w:tcPr>
           <w:p>
@@ -1936,7 +2109,7 @@
         </w:tc>
         <w:tc>
           <w:tcPr>
-            <w:tcW w:type="dxa" w:w="1993"/>
+            <w:tcW w:type="dxa" w:w="1996"/>
             <w:vAlign w:val="center"/>
           </w:tcPr>
           <w:p>
@@ -1954,7 +2127,7 @@
         </w:tc>
         <w:tc>
           <w:tcPr>
-            <w:tcW w:type="dxa" w:w="1993"/>
+            <w:tcW w:type="dxa" w:w="1996"/>
             <w:vAlign w:val="center"/>
           </w:tcPr>
           <w:p>
@@ -1974,7 +2147,7 @@
       <w:tr>
         <w:tc>
           <w:tcPr>
-            <w:tcW w:type="dxa" w:w="1993"/>
+            <w:tcW w:type="dxa" w:w="1996"/>
             <w:vAlign w:val="center"/>
           </w:tcPr>
           <w:p>
@@ -1992,7 +2165,7 @@
         </w:tc>
         <w:tc>
           <w:tcPr>
-            <w:tcW w:type="dxa" w:w="1993"/>
+            <w:tcW w:type="dxa" w:w="1996"/>
             <w:vAlign w:val="center"/>
           </w:tcPr>
           <w:p>
@@ -2010,7 +2183,7 @@
         </w:tc>
         <w:tc>
           <w:tcPr>
-            <w:tcW w:type="dxa" w:w="1993"/>
+            <w:tcW w:type="dxa" w:w="1996"/>
             <w:vAlign w:val="center"/>
           </w:tcPr>
           <w:p>
@@ -2028,7 +2201,7 @@
         </w:tc>
         <w:tc>
           <w:tcPr>
-            <w:tcW w:type="dxa" w:w="1993"/>
+            <w:tcW w:type="dxa" w:w="1996"/>
             <w:vAlign w:val="center"/>
           </w:tcPr>
           <w:p>
@@ -2046,7 +2219,7 @@
         </w:tc>
         <w:tc>
           <w:tcPr>
-            <w:tcW w:type="dxa" w:w="1993"/>
+            <w:tcW w:type="dxa" w:w="1996"/>
             <w:vAlign w:val="center"/>
           </w:tcPr>
           <w:p>
@@ -2228,17 +2401,17 @@
         </w:tblBorders>
       </w:tblPr>
       <w:tblGrid>
-        <w:gridCol w:w="1661"/>
-        <w:gridCol w:w="1661"/>
-        <w:gridCol w:w="1661"/>
-        <w:gridCol w:w="1661"/>
-        <w:gridCol w:w="1661"/>
-        <w:gridCol w:w="1661"/>
+        <w:gridCol w:w="1663"/>
+        <w:gridCol w:w="1663"/>
+        <w:gridCol w:w="1663"/>
+        <w:gridCol w:w="1663"/>
+        <w:gridCol w:w="1663"/>
+        <w:gridCol w:w="1663"/>
       </w:tblGrid>
       <w:tr>
         <w:tc>
           <w:tcPr>
-            <w:tcW w:type="dxa" w:w="1661"/>
+            <w:tcW w:type="dxa" w:w="1663"/>
             <w:vAlign w:val="center"/>
             <w:shd w:fill="E8EEF5"/>
           </w:tcPr>
@@ -2258,7 +2431,7 @@
         </w:tc>
         <w:tc>
           <w:tcPr>
-            <w:tcW w:type="dxa" w:w="1661"/>
+            <w:tcW w:type="dxa" w:w="1663"/>
             <w:vAlign w:val="center"/>
             <w:shd w:fill="E8EEF5"/>
           </w:tcPr>
@@ -2278,7 +2451,7 @@
         </w:tc>
         <w:tc>
           <w:tcPr>
-            <w:tcW w:type="dxa" w:w="1661"/>
+            <w:tcW w:type="dxa" w:w="1663"/>
             <w:vAlign w:val="center"/>
             <w:shd w:fill="E8EEF5"/>
           </w:tcPr>
@@ -2298,7 +2471,7 @@
         </w:tc>
         <w:tc>
           <w:tcPr>
-            <w:tcW w:type="dxa" w:w="1661"/>
+            <w:tcW w:type="dxa" w:w="1663"/>
             <w:vAlign w:val="center"/>
             <w:shd w:fill="E8EEF5"/>
           </w:tcPr>
@@ -2318,7 +2491,7 @@
         </w:tc>
         <w:tc>
           <w:tcPr>
-            <w:tcW w:type="dxa" w:w="1661"/>
+            <w:tcW w:type="dxa" w:w="1663"/>
             <w:vAlign w:val="center"/>
             <w:shd w:fill="E8EEF5"/>
           </w:tcPr>
@@ -2338,7 +2511,7 @@
         </w:tc>
         <w:tc>
           <w:tcPr>
-            <w:tcW w:type="dxa" w:w="1661"/>
+            <w:tcW w:type="dxa" w:w="1663"/>
             <w:vAlign w:val="center"/>
             <w:shd w:fill="E8EEF5"/>
           </w:tcPr>
@@ -2360,7 +2533,7 @@
       <w:tr>
         <w:tc>
           <w:tcPr>
-            <w:tcW w:type="dxa" w:w="1661"/>
+            <w:tcW w:type="dxa" w:w="1663"/>
             <w:vAlign w:val="center"/>
           </w:tcPr>
           <w:p>
@@ -2378,7 +2551,7 @@
         </w:tc>
         <w:tc>
           <w:tcPr>
-            <w:tcW w:type="dxa" w:w="1661"/>
+            <w:tcW w:type="dxa" w:w="1663"/>
             <w:vAlign w:val="center"/>
           </w:tcPr>
           <w:p>
@@ -2396,7 +2569,7 @@
         </w:tc>
         <w:tc>
           <w:tcPr>
-            <w:tcW w:type="dxa" w:w="1661"/>
+            <w:tcW w:type="dxa" w:w="1663"/>
             <w:vAlign w:val="center"/>
           </w:tcPr>
           <w:p>
@@ -2414,7 +2587,7 @@
         </w:tc>
         <w:tc>
           <w:tcPr>
-            <w:tcW w:type="dxa" w:w="1661"/>
+            <w:tcW w:type="dxa" w:w="1663"/>
             <w:vAlign w:val="center"/>
           </w:tcPr>
           <w:p>
@@ -2432,7 +2605,7 @@
         </w:tc>
         <w:tc>
           <w:tcPr>
-            <w:tcW w:type="dxa" w:w="1661"/>
+            <w:tcW w:type="dxa" w:w="1663"/>
             <w:vAlign w:val="center"/>
           </w:tcPr>
           <w:p>
@@ -2450,7 +2623,7 @@
         </w:tc>
         <w:tc>
           <w:tcPr>
-            <w:tcW w:type="dxa" w:w="1661"/>
+            <w:tcW w:type="dxa" w:w="1663"/>
             <w:vAlign w:val="center"/>
           </w:tcPr>
           <w:p>
@@ -2470,7 +2643,7 @@
       <w:tr>
         <w:tc>
           <w:tcPr>
-            <w:tcW w:type="dxa" w:w="1661"/>
+            <w:tcW w:type="dxa" w:w="1663"/>
             <w:vAlign w:val="center"/>
           </w:tcPr>
           <w:p>
@@ -2488,7 +2661,7 @@
         </w:tc>
         <w:tc>
           <w:tcPr>
-            <w:tcW w:type="dxa" w:w="1661"/>
+            <w:tcW w:type="dxa" w:w="1663"/>
             <w:vAlign w:val="center"/>
           </w:tcPr>
           <w:p>
@@ -2506,7 +2679,7 @@
         </w:tc>
         <w:tc>
           <w:tcPr>
-            <w:tcW w:type="dxa" w:w="1661"/>
+            <w:tcW w:type="dxa" w:w="1663"/>
             <w:vAlign w:val="center"/>
           </w:tcPr>
           <w:p>
@@ -2524,7 +2697,7 @@
         </w:tc>
         <w:tc>
           <w:tcPr>
-            <w:tcW w:type="dxa" w:w="1661"/>
+            <w:tcW w:type="dxa" w:w="1663"/>
             <w:vAlign w:val="center"/>
           </w:tcPr>
           <w:p>
@@ -2542,7 +2715,7 @@
         </w:tc>
         <w:tc>
           <w:tcPr>
-            <w:tcW w:type="dxa" w:w="1661"/>
+            <w:tcW w:type="dxa" w:w="1663"/>
             <w:vAlign w:val="center"/>
           </w:tcPr>
           <w:p>
@@ -2560,7 +2733,7 @@
         </w:tc>
         <w:tc>
           <w:tcPr>
-            <w:tcW w:type="dxa" w:w="1661"/>
+            <w:tcW w:type="dxa" w:w="1663"/>
             <w:vAlign w:val="center"/>
           </w:tcPr>
           <w:p>
@@ -2712,20 +2885,20 @@
         </w:tblBorders>
       </w:tblPr>
       <w:tblGrid>
-        <w:gridCol w:w="1107"/>
-        <w:gridCol w:w="1107"/>
-        <w:gridCol w:w="1107"/>
-        <w:gridCol w:w="1107"/>
-        <w:gridCol w:w="1107"/>
-        <w:gridCol w:w="1107"/>
-        <w:gridCol w:w="1107"/>
-        <w:gridCol w:w="1107"/>
-        <w:gridCol w:w="1107"/>
+        <w:gridCol w:w="1109"/>
+        <w:gridCol w:w="1109"/>
+        <w:gridCol w:w="1109"/>
+        <w:gridCol w:w="1109"/>
+        <w:gridCol w:w="1109"/>
+        <w:gridCol w:w="1109"/>
+        <w:gridCol w:w="1109"/>
+        <w:gridCol w:w="1109"/>
+        <w:gridCol w:w="1109"/>
       </w:tblGrid>
       <w:tr>
         <w:tc>
           <w:tcPr>
-            <w:tcW w:type="dxa" w:w="1107"/>
+            <w:tcW w:type="dxa" w:w="1109"/>
             <w:vAlign w:val="center"/>
             <w:shd w:fill="E8EEF5"/>
           </w:tcPr>
@@ -2745,7 +2918,7 @@
         </w:tc>
         <w:tc>
           <w:tcPr>
-            <w:tcW w:type="dxa" w:w="1107"/>
+            <w:tcW w:type="dxa" w:w="1109"/>
             <w:vAlign w:val="center"/>
             <w:shd w:fill="E8EEF5"/>
           </w:tcPr>
@@ -2765,7 +2938,7 @@
         </w:tc>
         <w:tc>
           <w:tcPr>
-            <w:tcW w:type="dxa" w:w="1107"/>
+            <w:tcW w:type="dxa" w:w="1109"/>
             <w:vAlign w:val="center"/>
             <w:shd w:fill="E8EEF5"/>
           </w:tcPr>
@@ -2785,7 +2958,7 @@
         </w:tc>
         <w:tc>
           <w:tcPr>
-            <w:tcW w:type="dxa" w:w="1107"/>
+            <w:tcW w:type="dxa" w:w="1109"/>
             <w:vAlign w:val="center"/>
             <w:shd w:fill="E8EEF5"/>
           </w:tcPr>
@@ -2805,7 +2978,7 @@
         </w:tc>
         <w:tc>
           <w:tcPr>
-            <w:tcW w:type="dxa" w:w="1107"/>
+            <w:tcW w:type="dxa" w:w="1109"/>
             <w:vAlign w:val="center"/>
             <w:shd w:fill="E8EEF5"/>
           </w:tcPr>
@@ -2825,7 +2998,7 @@
         </w:tc>
         <w:tc>
           <w:tcPr>
-            <w:tcW w:type="dxa" w:w="1107"/>
+            <w:tcW w:type="dxa" w:w="1109"/>
             <w:vAlign w:val="center"/>
             <w:shd w:fill="E8EEF5"/>
           </w:tcPr>
@@ -2845,7 +3018,7 @@
         </w:tc>
         <w:tc>
           <w:tcPr>
-            <w:tcW w:type="dxa" w:w="1107"/>
+            <w:tcW w:type="dxa" w:w="1109"/>
             <w:vAlign w:val="center"/>
             <w:shd w:fill="E8EEF5"/>
           </w:tcPr>
@@ -2865,7 +3038,7 @@
         </w:tc>
         <w:tc>
           <w:tcPr>
-            <w:tcW w:type="dxa" w:w="1107"/>
+            <w:tcW w:type="dxa" w:w="1109"/>
             <w:vAlign w:val="center"/>
             <w:shd w:fill="E8EEF5"/>
           </w:tcPr>
@@ -2885,7 +3058,7 @@
         </w:tc>
         <w:tc>
           <w:tcPr>
-            <w:tcW w:type="dxa" w:w="1107"/>
+            <w:tcW w:type="dxa" w:w="1109"/>
             <w:vAlign w:val="center"/>
             <w:shd w:fill="E8EEF5"/>
           </w:tcPr>
@@ -2907,7 +3080,7 @@
       <w:tr>
         <w:tc>
           <w:tcPr>
-            <w:tcW w:type="dxa" w:w="1107"/>
+            <w:tcW w:type="dxa" w:w="1109"/>
             <w:vAlign w:val="center"/>
           </w:tcPr>
           <w:p>
@@ -2925,7 +3098,7 @@
         </w:tc>
         <w:tc>
           <w:tcPr>
-            <w:tcW w:type="dxa" w:w="1107"/>
+            <w:tcW w:type="dxa" w:w="1109"/>
             <w:vAlign w:val="center"/>
           </w:tcPr>
           <w:p>
@@ -2943,7 +3116,7 @@
         </w:tc>
         <w:tc>
           <w:tcPr>
-            <w:tcW w:type="dxa" w:w="1107"/>
+            <w:tcW w:type="dxa" w:w="1109"/>
             <w:vAlign w:val="center"/>
           </w:tcPr>
           <w:p>
@@ -2961,7 +3134,7 @@
         </w:tc>
         <w:tc>
           <w:tcPr>
-            <w:tcW w:type="dxa" w:w="1107"/>
+            <w:tcW w:type="dxa" w:w="1109"/>
             <w:vAlign w:val="center"/>
           </w:tcPr>
           <w:p>
@@ -2979,7 +3152,7 @@
         </w:tc>
         <w:tc>
           <w:tcPr>
-            <w:tcW w:type="dxa" w:w="1107"/>
+            <w:tcW w:type="dxa" w:w="1109"/>
             <w:vAlign w:val="center"/>
           </w:tcPr>
           <w:p>
@@ -2997,7 +3170,7 @@
         </w:tc>
         <w:tc>
           <w:tcPr>
-            <w:tcW w:type="dxa" w:w="1107"/>
+            <w:tcW w:type="dxa" w:w="1109"/>
             <w:vAlign w:val="center"/>
           </w:tcPr>
           <w:p>
@@ -3015,7 +3188,7 @@
         </w:tc>
         <w:tc>
           <w:tcPr>
-            <w:tcW w:type="dxa" w:w="1107"/>
+            <w:tcW w:type="dxa" w:w="1109"/>
             <w:vAlign w:val="center"/>
           </w:tcPr>
           <w:p>
@@ -3033,7 +3206,7 @@
         </w:tc>
         <w:tc>
           <w:tcPr>
-            <w:tcW w:type="dxa" w:w="1107"/>
+            <w:tcW w:type="dxa" w:w="1109"/>
             <w:vAlign w:val="center"/>
           </w:tcPr>
           <w:p>
@@ -3051,7 +3224,7 @@
         </w:tc>
         <w:tc>
           <w:tcPr>
-            <w:tcW w:type="dxa" w:w="1107"/>
+            <w:tcW w:type="dxa" w:w="1109"/>
             <w:vAlign w:val="center"/>
           </w:tcPr>
           <w:p>
@@ -3071,7 +3244,7 @@
       <w:tr>
         <w:tc>
           <w:tcPr>
-            <w:tcW w:type="dxa" w:w="1107"/>
+            <w:tcW w:type="dxa" w:w="1109"/>
             <w:vAlign w:val="center"/>
           </w:tcPr>
           <w:p>
@@ -3089,7 +3262,7 @@
         </w:tc>
         <w:tc>
           <w:tcPr>
-            <w:tcW w:type="dxa" w:w="1107"/>
+            <w:tcW w:type="dxa" w:w="1109"/>
             <w:vAlign w:val="center"/>
           </w:tcPr>
           <w:p>
@@ -3107,7 +3280,7 @@
         </w:tc>
         <w:tc>
           <w:tcPr>
-            <w:tcW w:type="dxa" w:w="1107"/>
+            <w:tcW w:type="dxa" w:w="1109"/>
             <w:vAlign w:val="center"/>
           </w:tcPr>
           <w:p>
@@ -3125,7 +3298,7 @@
         </w:tc>
         <w:tc>
           <w:tcPr>
-            <w:tcW w:type="dxa" w:w="1107"/>
+            <w:tcW w:type="dxa" w:w="1109"/>
             <w:vAlign w:val="center"/>
           </w:tcPr>
           <w:p>
@@ -3143,7 +3316,7 @@
         </w:tc>
         <w:tc>
           <w:tcPr>
-            <w:tcW w:type="dxa" w:w="1107"/>
+            <w:tcW w:type="dxa" w:w="1109"/>
             <w:vAlign w:val="center"/>
           </w:tcPr>
           <w:p>
@@ -3161,7 +3334,7 @@
         </w:tc>
         <w:tc>
           <w:tcPr>
-            <w:tcW w:type="dxa" w:w="1107"/>
+            <w:tcW w:type="dxa" w:w="1109"/>
             <w:vAlign w:val="center"/>
           </w:tcPr>
           <w:p>
@@ -3179,7 +3352,7 @@
         </w:tc>
         <w:tc>
           <w:tcPr>
-            <w:tcW w:type="dxa" w:w="1107"/>
+            <w:tcW w:type="dxa" w:w="1109"/>
             <w:vAlign w:val="center"/>
           </w:tcPr>
           <w:p>
@@ -3197,7 +3370,7 @@
         </w:tc>
         <w:tc>
           <w:tcPr>
-            <w:tcW w:type="dxa" w:w="1107"/>
+            <w:tcW w:type="dxa" w:w="1109"/>
             <w:vAlign w:val="center"/>
           </w:tcPr>
           <w:p>
@@ -3215,7 +3388,7 @@
         </w:tc>
         <w:tc>
           <w:tcPr>
-            <w:tcW w:type="dxa" w:w="1107"/>
+            <w:tcW w:type="dxa" w:w="1109"/>
             <w:vAlign w:val="center"/>
           </w:tcPr>
           <w:p>
@@ -3235,7 +3408,7 @@
       <w:tr>
         <w:tc>
           <w:tcPr>
-            <w:tcW w:type="dxa" w:w="1107"/>
+            <w:tcW w:type="dxa" w:w="1109"/>
             <w:vAlign w:val="center"/>
           </w:tcPr>
           <w:p>
@@ -3253,7 +3426,7 @@
         </w:tc>
         <w:tc>
           <w:tcPr>
-            <w:tcW w:type="dxa" w:w="1107"/>
+            <w:tcW w:type="dxa" w:w="1109"/>
             <w:vAlign w:val="center"/>
           </w:tcPr>
           <w:p>
@@ -3271,7 +3444,7 @@
         </w:tc>
         <w:tc>
           <w:tcPr>
-            <w:tcW w:type="dxa" w:w="1107"/>
+            <w:tcW w:type="dxa" w:w="1109"/>
             <w:vAlign w:val="center"/>
           </w:tcPr>
           <w:p>
@@ -3289,7 +3462,7 @@
         </w:tc>
         <w:tc>
           <w:tcPr>
-            <w:tcW w:type="dxa" w:w="1107"/>
+            <w:tcW w:type="dxa" w:w="1109"/>
             <w:vAlign w:val="center"/>
           </w:tcPr>
           <w:p>
@@ -3307,7 +3480,7 @@
         </w:tc>
         <w:tc>
           <w:tcPr>
-            <w:tcW w:type="dxa" w:w="1107"/>
+            <w:tcW w:type="dxa" w:w="1109"/>
             <w:vAlign w:val="center"/>
           </w:tcPr>
           <w:p>
@@ -3325,7 +3498,7 @@
         </w:tc>
         <w:tc>
           <w:tcPr>
-            <w:tcW w:type="dxa" w:w="1107"/>
+            <w:tcW w:type="dxa" w:w="1109"/>
             <w:vAlign w:val="center"/>
           </w:tcPr>
           <w:p>
@@ -3343,7 +3516,7 @@
         </w:tc>
         <w:tc>
           <w:tcPr>
-            <w:tcW w:type="dxa" w:w="1107"/>
+            <w:tcW w:type="dxa" w:w="1109"/>
             <w:vAlign w:val="center"/>
           </w:tcPr>
           <w:p>
@@ -3361,7 +3534,7 @@
         </w:tc>
         <w:tc>
           <w:tcPr>
-            <w:tcW w:type="dxa" w:w="1107"/>
+            <w:tcW w:type="dxa" w:w="1109"/>
             <w:vAlign w:val="center"/>
           </w:tcPr>
           <w:p>
@@ -3379,7 +3552,7 @@
         </w:tc>
         <w:tc>
           <w:tcPr>
-            <w:tcW w:type="dxa" w:w="1107"/>
+            <w:tcW w:type="dxa" w:w="1109"/>
             <w:vAlign w:val="center"/>
           </w:tcPr>
           <w:p>
@@ -3399,7 +3572,7 @@
       <w:tr>
         <w:tc>
           <w:tcPr>
-            <w:tcW w:type="dxa" w:w="1107"/>
+            <w:tcW w:type="dxa" w:w="1109"/>
             <w:vAlign w:val="center"/>
           </w:tcPr>
           <w:p>
@@ -3417,7 +3590,7 @@
         </w:tc>
         <w:tc>
           <w:tcPr>
-            <w:tcW w:type="dxa" w:w="1107"/>
+            <w:tcW w:type="dxa" w:w="1109"/>
             <w:vAlign w:val="center"/>
           </w:tcPr>
           <w:p>
@@ -3435,7 +3608,7 @@
         </w:tc>
         <w:tc>
           <w:tcPr>
-            <w:tcW w:type="dxa" w:w="1107"/>
+            <w:tcW w:type="dxa" w:w="1109"/>
             <w:vAlign w:val="center"/>
           </w:tcPr>
           <w:p>
@@ -3453,7 +3626,7 @@
         </w:tc>
         <w:tc>
           <w:tcPr>
-            <w:tcW w:type="dxa" w:w="1107"/>
+            <w:tcW w:type="dxa" w:w="1109"/>
             <w:vAlign w:val="center"/>
           </w:tcPr>
           <w:p>
@@ -3471,7 +3644,7 @@
         </w:tc>
         <w:tc>
           <w:tcPr>
-            <w:tcW w:type="dxa" w:w="1107"/>
+            <w:tcW w:type="dxa" w:w="1109"/>
             <w:vAlign w:val="center"/>
           </w:tcPr>
           <w:p>
@@ -3489,7 +3662,7 @@
         </w:tc>
         <w:tc>
           <w:tcPr>
-            <w:tcW w:type="dxa" w:w="1107"/>
+            <w:tcW w:type="dxa" w:w="1109"/>
             <w:vAlign w:val="center"/>
           </w:tcPr>
           <w:p>
@@ -3507,7 +3680,7 @@
         </w:tc>
         <w:tc>
           <w:tcPr>
-            <w:tcW w:type="dxa" w:w="1107"/>
+            <w:tcW w:type="dxa" w:w="1109"/>
             <w:vAlign w:val="center"/>
           </w:tcPr>
           <w:p>
@@ -3525,7 +3698,7 @@
         </w:tc>
         <w:tc>
           <w:tcPr>
-            <w:tcW w:type="dxa" w:w="1107"/>
+            <w:tcW w:type="dxa" w:w="1109"/>
             <w:vAlign w:val="center"/>
           </w:tcPr>
           <w:p>
@@ -3543,7 +3716,7 @@
         </w:tc>
         <w:tc>
           <w:tcPr>
-            <w:tcW w:type="dxa" w:w="1107"/>
+            <w:tcW w:type="dxa" w:w="1109"/>
             <w:vAlign w:val="center"/>
           </w:tcPr>
           <w:p>
@@ -4647,7 +4820,7 @@
     </w:p>
     <w:sectPr>
       <w:pgSz w:w="12240" w:h="15840"/>
-      <w:pgMar w:top="1138" w:right="1138" w:bottom="1138" w:left="1138" w:header="720" w:footer="720" w:gutter="0"/>
+      <w:pgMar w:top="1138" w:right="850" w:bottom="1138" w:left="1411" w:header="720" w:footer="720" w:gutter="0"/>
       <w:cols w:space="720"/>
       <w:docGrid w:linePitch="360"/>
     </w:sectPr>

</xml_diff>